<commit_message>
chore: perbarui dan tambahkan template dokumen perjanjian kerja PPPK
</commit_message>
<xml_diff>
--- a/src/assets/img/data_samples/Template Perjanjian Kerja PPPK A4.docx
+++ b/src/assets/img/data_samples/Template Perjanjian Kerja PPPK A4.docx
@@ -200,7 +200,7 @@
           </mc:Choice>
           <mc:Fallback>
             <w:pict>
-              <v:line w14:anchorId="3B9AD9A5" id="Straight Connector 5" o:spid="_x0000_s1026" style="position:absolute;z-index:251659264;visibility:visible;mso-wrap-style:square;mso-width-percent:0;mso-height-percent:0;mso-wrap-distance-left:9pt;mso-wrap-distance-top:-3e-5mm;mso-wrap-distance-right:9pt;mso-wrap-distance-bottom:-3e-5mm;mso-position-horizontal:absolute;mso-position-horizontal-relative:text;mso-position-vertical:absolute;mso-position-vertical-relative:text;mso-width-percent:0;mso-height-percent:0;mso-width-relative:page;mso-height-relative:margin" from=".35pt,31.8pt" to="517.85pt,31.8pt" o:gfxdata="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" strokecolor="windowText" strokeweight="4pt">
+              <v:line w14:anchorId="2E40593B" id="Straight Connector 5" o:spid="_x0000_s1026" style="position:absolute;z-index:251659264;visibility:visible;mso-wrap-style:square;mso-width-percent:0;mso-height-percent:0;mso-wrap-distance-left:9pt;mso-wrap-distance-top:-3e-5mm;mso-wrap-distance-right:9pt;mso-wrap-distance-bottom:-3e-5mm;mso-position-horizontal:absolute;mso-position-horizontal-relative:text;mso-position-vertical:absolute;mso-position-vertical-relative:text;mso-width-percent:0;mso-height-percent:0;mso-width-relative:page;mso-height-relative:margin" from=".35pt,31.8pt" to="517.85pt,31.8pt" o:gfxdata="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" strokecolor="windowText" strokeweight="4pt">
                 <v:stroke linestyle="thickThin" joinstyle="miter"/>
                 <o:lock v:ext="edit" shapetype="f"/>
               </v:line>
@@ -2409,7 +2409,23 @@
           <w:sz w:val="24"/>
           <w:szCs w:val="24"/>
         </w:rPr>
-        <w:t>{{TMT_AWAL_BARU}}</w:t>
+        <w:t>{{TMT_AWAL_</w:t>
+      </w:r>
+      <w:r>
+        <w:rPr>
+          <w:rFonts w:ascii="Bookman Old Style" w:hAnsi="Bookman Old Style"/>
+          <w:sz w:val="24"/>
+          <w:szCs w:val="24"/>
+        </w:rPr>
+        <w:t>AKTIF</w:t>
+      </w:r>
+      <w:r>
+        <w:rPr>
+          <w:rFonts w:ascii="Bookman Old Style" w:hAnsi="Bookman Old Style"/>
+          <w:sz w:val="24"/>
+          <w:szCs w:val="24"/>
+        </w:rPr>
+        <w:t>}}</w:t>
       </w:r>
       <w:r>
         <w:rPr>
@@ -2425,7 +2441,23 @@
           <w:sz w:val="24"/>
           <w:szCs w:val="24"/>
         </w:rPr>
-        <w:t>{{TMT_AKHIR_BARU}}</w:t>
+        <w:t>{{TMT_AKHIR_</w:t>
+      </w:r>
+      <w:r>
+        <w:rPr>
+          <w:rFonts w:ascii="Bookman Old Style" w:hAnsi="Bookman Old Style"/>
+          <w:sz w:val="24"/>
+          <w:szCs w:val="24"/>
+        </w:rPr>
+        <w:t>AKTIF</w:t>
+      </w:r>
+      <w:r>
+        <w:rPr>
+          <w:rFonts w:ascii="Bookman Old Style" w:hAnsi="Bookman Old Style"/>
+          <w:sz w:val="24"/>
+          <w:szCs w:val="24"/>
+        </w:rPr>
+        <w:t>}}</w:t>
       </w:r>
     </w:p>
     <w:p>
@@ -29791,7 +29823,6 @@
         <w:t>perjanjian</w:t>
       </w:r>
       <w:proofErr w:type="spellEnd"/>
-      <w:proofErr w:type="gramStart"/>
       <w:r>
         <w:rPr>
           <w:rFonts w:ascii="Bookman Old Style" w:hAnsi="Bookman Old Style"/>
@@ -29799,17 +29830,32 @@
           <w:sz w:val="24"/>
           <w:szCs w:val="24"/>
         </w:rPr>
-        <w:t>}}{</w:t>
-      </w:r>
-      <w:proofErr w:type="gramEnd"/>
-      <w:r>
+        <w:t>}}</w:t>
+      </w:r>
+    </w:p>
+    <w:p>
+      <w:pPr>
+        <w:tabs>
+          <w:tab w:val="left" w:pos="426"/>
+          <w:tab w:val="left" w:pos="851"/>
+        </w:tabs>
+        <w:spacing w:after="0" w:line="360" w:lineRule="auto"/>
+        <w:jc w:val="center"/>
         <w:rPr>
           <w:rFonts w:ascii="Bookman Old Style" w:hAnsi="Bookman Old Style"/>
           <w:b/>
           <w:sz w:val="24"/>
           <w:szCs w:val="24"/>
         </w:rPr>
-        <w:t>{#tandatangan}}</w:t>
+      </w:pPr>
+      <w:r>
+        <w:rPr>
+          <w:rFonts w:ascii="Bookman Old Style" w:hAnsi="Bookman Old Style"/>
+          <w:b/>
+          <w:sz w:val="24"/>
+          <w:szCs w:val="24"/>
+        </w:rPr>
+        <w:t>{{#tandatangan}}</w:t>
       </w:r>
     </w:p>
     <w:p>

</xml_diff>